<commit_message>
docs: refresh consolidated folder with CTU-compliant deliverables
Update the DOCX/PDF in TAI_LIEU_HOAN_CHINH with the rebuilt versions aligned
to CTU Decision 1799/2021 (thesis docs: line spacing 1.2; PDF: A4, Times-
metric 13pt, margins 3/2cm, spacing 1.2). Source MD, P1/P2/meta/book chapter,
and evidence unchanged.

https://claude.ai/code/session_01TNqoRFY1vAVQL6GWg8X9M3
</commit_message>
<xml_diff>
--- a/TAI_LIEU_HOAN_CHINH/01_Papers/P3_Vietnam_JABS/p3_vietnam_vi.docx
+++ b/TAI_LIEU_HOAN_CHINH/01_Papers/P3_Vietnam_JABS/p3_vietnam_vi.docx
@@ -22438,7 +22438,7 @@
     <w:name w:val="Normal"/>
     <w:qFormat/>
     <w:pPr>
-      <w:spacing w:line="360" w:lineRule="auto"/>
+      <w:spacing w:line="288" w:lineRule="auto"/>
       <w:jc w:val="both"/>
     </w:pPr>
     <w:rPr>
@@ -22452,7 +22452,7 @@
     <w:basedOn w:val="Normal"/>
     <w:link w:val="BodyTextChar"/>
     <w:pPr>
-      <w:spacing w:after="180" w:before="180" w:line="360" w:lineRule="auto"/>
+      <w:spacing w:after="180" w:before="180" w:line="288" w:lineRule="auto"/>
       <w:jc w:val="both"/>
     </w:pPr>
     <w:qFormat/>
@@ -22468,7 +22468,7 @@
     <w:next w:val="BodyText"/>
     <w:qFormat/>
     <w:pPr>
-      <w:spacing w:line="360" w:lineRule="auto"/>
+      <w:spacing w:line="288" w:lineRule="auto"/>
       <w:jc w:val="both"/>
     </w:pPr>
     <w:rPr>
@@ -22482,7 +22482,7 @@
     <w:basedOn w:val="BodyText"/>
     <w:qFormat/>
     <w:pPr>
-      <w:spacing w:after="36" w:before="36" w:line="360" w:lineRule="auto"/>
+      <w:spacing w:after="36" w:before="36" w:line="288" w:lineRule="auto"/>
       <w:jc w:val="both"/>
     </w:pPr>
     <w:rPr>
@@ -22499,7 +22499,7 @@
     <w:pPr>
       <w:keepNext/>
       <w:keepLines/>
-      <w:spacing w:after="240" w:before="480" w:line="360" w:lineRule="auto"/>
+      <w:spacing w:after="240" w:before="480" w:line="288" w:lineRule="auto"/>
       <w:jc w:val="both"/>
     </w:pPr>
     <w:rPr>
@@ -22519,7 +22519,7 @@
     <w:pPr>
       <w:keepNext/>
       <w:keepLines/>
-      <w:spacing w:after="240" w:before="240" w:line="360" w:lineRule="auto"/>
+      <w:spacing w:after="240" w:before="240" w:line="288" w:lineRule="auto"/>
       <w:jc w:val="both"/>
     </w:pPr>
     <w:rPr>
@@ -22536,7 +22536,7 @@
     <w:pPr>
       <w:keepNext/>
       <w:keepLines/>
-      <w:spacing w:line="360" w:lineRule="auto"/>
+      <w:spacing w:line="288" w:lineRule="auto"/>
       <w:jc w:val="both"/>
     </w:pPr>
     <w:rPr>
@@ -22552,7 +22552,7 @@
     <w:pPr>
       <w:keepNext/>
       <w:keepLines/>
-      <w:spacing w:line="360" w:lineRule="auto"/>
+      <w:spacing w:line="288" w:lineRule="auto"/>
       <w:jc w:val="both"/>
     </w:pPr>
     <w:rPr>
@@ -22570,7 +22570,7 @@
       <w:keepNext/>
       <w:keepLines/>
       <w:jc w:val="both"/>
-      <w:spacing w:after="0" w:before="300" w:line="360" w:lineRule="auto"/>
+      <w:spacing w:after="0" w:before="300" w:line="288" w:lineRule="auto"/>
     </w:pPr>
     <w:rPr>
       <w:color w:val="000000"/>
@@ -22588,7 +22588,7 @@
     <w:pPr>
       <w:keepNext/>
       <w:keepLines/>
-      <w:spacing w:after="300" w:before="100" w:line="360" w:lineRule="auto"/>
+      <w:spacing w:after="300" w:before="100" w:line="288" w:lineRule="auto"/>
       <w:jc w:val="both"/>
     </w:pPr>
     <w:rPr>
@@ -22604,7 +22604,7 @@
     <w:next w:val="Bibliography"/>
     <w:qFormat/>
     <w:pPr>
-      <w:spacing w:line="360" w:lineRule="auto"/>
+      <w:spacing w:line="288" w:lineRule="auto"/>
       <w:jc w:val="both"/>
     </w:pPr>
     <w:rPr>
@@ -22622,7 +22622,7 @@
     <w:pPr>
       <w:keepNext/>
       <w:keepLines/>
-      <w:spacing w:after="0" w:before="480" w:line="360" w:lineRule="auto"/>
+      <w:spacing w:after="0" w:before="480" w:line="288" w:lineRule="auto"/>
       <w:jc w:val="both"/>
       <w:outlineLvl w:val="0"/>
     </w:pPr>
@@ -22645,7 +22645,7 @@
     <w:pPr>
       <w:keepNext/>
       <w:keepLines/>
-      <w:spacing w:after="0" w:before="200" w:line="360" w:lineRule="auto"/>
+      <w:spacing w:after="0" w:before="200" w:line="288" w:lineRule="auto"/>
       <w:jc w:val="both"/>
       <w:outlineLvl w:val="1"/>
     </w:pPr>
@@ -22668,7 +22668,7 @@
     <w:pPr>
       <w:keepNext/>
       <w:keepLines/>
-      <w:spacing w:after="0" w:before="200" w:line="360" w:lineRule="auto"/>
+      <w:spacing w:after="0" w:before="200" w:line="288" w:lineRule="auto"/>
       <w:jc w:val="both"/>
       <w:outlineLvl w:val="2"/>
     </w:pPr>
@@ -22691,7 +22691,7 @@
     <w:pPr>
       <w:keepNext/>
       <w:keepLines/>
-      <w:spacing w:after="0" w:before="200" w:line="360" w:lineRule="auto"/>
+      <w:spacing w:after="0" w:before="200" w:line="288" w:lineRule="auto"/>
       <w:jc w:val="both"/>
       <w:outlineLvl w:val="3"/>
     </w:pPr>
@@ -22714,7 +22714,7 @@
     <w:pPr>
       <w:keepNext/>
       <w:keepLines/>
-      <w:spacing w:after="0" w:before="200" w:line="360" w:lineRule="auto"/>
+      <w:spacing w:after="0" w:before="200" w:line="288" w:lineRule="auto"/>
       <w:jc w:val="both"/>
       <w:outlineLvl w:val="4"/>
     </w:pPr>
@@ -22736,7 +22736,7 @@
     <w:pPr>
       <w:keepNext/>
       <w:keepLines/>
-      <w:spacing w:after="0" w:before="200" w:line="360" w:lineRule="auto"/>
+      <w:spacing w:after="0" w:before="200" w:line="288" w:lineRule="auto"/>
       <w:jc w:val="both"/>
       <w:outlineLvl w:val="5"/>
     </w:pPr>
@@ -22757,7 +22757,7 @@
     <w:pPr>
       <w:keepNext/>
       <w:keepLines/>
-      <w:spacing w:after="0" w:before="200" w:line="360" w:lineRule="auto"/>
+      <w:spacing w:after="0" w:before="200" w:line="288" w:lineRule="auto"/>
       <w:jc w:val="both"/>
       <w:outlineLvl w:val="6"/>
     </w:pPr>
@@ -22778,7 +22778,7 @@
     <w:pPr>
       <w:keepNext/>
       <w:keepLines/>
-      <w:spacing w:after="0" w:before="200" w:line="360" w:lineRule="auto"/>
+      <w:spacing w:after="0" w:before="200" w:line="288" w:lineRule="auto"/>
       <w:jc w:val="both"/>
       <w:outlineLvl w:val="7"/>
     </w:pPr>
@@ -22799,7 +22799,7 @@
     <w:pPr>
       <w:keepNext/>
       <w:keepLines/>
-      <w:spacing w:after="0" w:before="200" w:line="360" w:lineRule="auto"/>
+      <w:spacing w:after="0" w:before="200" w:line="288" w:lineRule="auto"/>
       <w:jc w:val="both"/>
       <w:outlineLvl w:val="8"/>
     </w:pPr>
@@ -22818,7 +22818,7 @@
     <w:unhideWhenUsed/>
     <w:qFormat/>
     <w:pPr>
-      <w:spacing w:after="100" w:before="100" w:line="360" w:lineRule="auto"/>
+      <w:spacing w:after="100" w:before="100" w:line="288" w:lineRule="auto"/>
       <w:ind w:firstLine="0" w:left="480" w:right="480"/>
       <w:jc w:val="both"/>
     </w:pPr>
@@ -22836,7 +22836,7 @@
     <w:unhideWhenUsed/>
     <w:qFormat/>
     <w:pPr>
-      <w:spacing w:line="360" w:lineRule="auto"/>
+      <w:spacing w:line="288" w:lineRule="auto"/>
       <w:jc w:val="both"/>
     </w:pPr>
     <w:rPr>
@@ -22862,7 +22862,7 @@
     <w:unhideWhenUsed/>
     <w:qFormat/>
     <w:pPr>
-      <w:spacing w:line="360" w:lineRule="auto"/>
+      <w:spacing w:line="288" w:lineRule="auto"/>
       <w:jc w:val="both"/>
     </w:pPr>
     <w:rPr>
@@ -22902,7 +22902,7 @@
     <w:pPr>
       <w:keepNext/>
       <w:keepLines/>
-      <w:spacing w:after="0" w:line="360" w:lineRule="auto"/>
+      <w:spacing w:after="0" w:line="288" w:lineRule="auto"/>
       <w:jc w:val="both"/>
     </w:pPr>
     <w:rPr>
@@ -22916,7 +22916,7 @@
     <w:name w:val="Definition"/>
     <w:basedOn w:val="Normal"/>
     <w:pPr>
-      <w:spacing w:line="360" w:lineRule="auto"/>
+      <w:spacing w:line="288" w:lineRule="auto"/>
       <w:jc w:val="both"/>
     </w:pPr>
     <w:rPr>
@@ -22930,7 +22930,7 @@
     <w:basedOn w:val="Normal"/>
     <w:link w:val="BodyTextChar"/>
     <w:pPr>
-      <w:spacing w:after="120" w:before="0" w:line="360" w:lineRule="auto"/>
+      <w:spacing w:after="120" w:before="0" w:line="288" w:lineRule="auto"/>
       <w:jc w:val="both"/>
     </w:pPr>
     <w:rPr>
@@ -22945,7 +22945,7 @@
     <w:basedOn w:val="Caption"/>
     <w:pPr>
       <w:keepNext/>
-      <w:spacing w:line="360" w:lineRule="auto"/>
+      <w:spacing w:line="288" w:lineRule="auto"/>
       <w:jc w:val="both"/>
     </w:pPr>
     <w:rPr>
@@ -22958,7 +22958,7 @@
     <w:name w:val="Image Caption"/>
     <w:basedOn w:val="Caption"/>
     <w:pPr>
-      <w:spacing w:line="360" w:lineRule="auto"/>
+      <w:spacing w:line="288" w:lineRule="auto"/>
       <w:jc w:val="both"/>
     </w:pPr>
     <w:rPr>
@@ -22971,7 +22971,7 @@
     <w:name w:val="Figure"/>
     <w:basedOn w:val="Normal"/>
     <w:pPr>
-      <w:spacing w:line="360" w:lineRule="auto"/>
+      <w:spacing w:line="288" w:lineRule="auto"/>
       <w:jc w:val="both"/>
     </w:pPr>
     <w:rPr>
@@ -22985,7 +22985,7 @@
     <w:basedOn w:val="Figure"/>
     <w:pPr>
       <w:keepNext/>
-      <w:spacing w:line="360" w:lineRule="auto"/>
+      <w:spacing w:line="288" w:lineRule="auto"/>
       <w:jc w:val="both"/>
     </w:pPr>
     <w:rPr>
@@ -23049,7 +23049,7 @@
     <w:unhideWhenUsed/>
     <w:qFormat/>
     <w:pPr>
-      <w:spacing w:before="240" w:line="360" w:lineRule="auto"/>
+      <w:spacing w:before="240" w:line="288" w:lineRule="auto"/>
       <w:jc w:val="both"/>
       <w:outlineLvl w:val="9"/>
     </w:pPr>

</xml_diff>